<commit_message>
Remove a data duplicada no final de cada âmbito
O modelo .docx tinha um placeholder {{DATA_ATUALIZACAO_VALORES}} próprio
depois de cada âmbito (Federal/Estadual/Municipal), além da data que o
próprio texto do âmbito já inclui ("(valores atualizados no dia X)") —
resultado: duas datas na tela, uma delas sem nenhum texto explicando o
que é. Removido o parágrafo do placeholder de templates/modelo_memorando.docx
(o modelo real com timbrado do escritório, MODELO_MEMORANDO_n8n.docx, não é
versionado, mas recebeu a mesma correção localmente).

De quebra, achei e corrigi outra inconsistência relacionada: o RESUMO
usava sempre o total da certidão municipal, mesmo quando o corpo do texto
já mostrava o total do parcelamento (prioridade confirmada antes). Agora
o RESUMO bate com o número mostrado no âmbito.

28/28 fatos do tests/test_fatos.py continuam batendo.

Co-Authored-By: Claude Sonnet 5 <noreply@anthropic.com>
</commit_message>
<xml_diff>
--- a/templates/modelo_memorando.docx
+++ b/templates/modelo_memorando.docx
@@ -153,25 +153,6 @@
     </w:p>
     <w:p>
       <w:pPr>
-        <w:spacing w:afterLines="120" w:after="288" w:line="360" w:lineRule="auto"/>
-        <w:ind w:firstLine="720"/>
-        <w:rPr>
-          <w:i/>
-          <w:iCs/>
-          <w:color w:val="808080"/>
-        </w:rPr>
-      </w:pPr>
-      <w:r>
-        <w:rPr>
-          <w:i/>
-          <w:iCs/>
-          <w:color w:val="808080"/>
-        </w:rPr>
-        <w:t>{{DATA_ATUALIZACAO_VALORES}}</w:t>
-      </w:r>
-    </w:p>
-    <w:p>
-      <w:pPr>
         <w:pBdr>
           <w:top w:val="single" w:sz="4" w:space="1" w:color="auto"/>
         </w:pBdr>
@@ -217,25 +198,6 @@
     </w:p>
     <w:p>
       <w:pPr>
-        <w:spacing w:afterLines="120" w:after="288" w:line="360" w:lineRule="auto"/>
-        <w:ind w:firstLine="720"/>
-        <w:rPr>
-          <w:i/>
-          <w:iCs/>
-          <w:color w:val="808080"/>
-        </w:rPr>
-      </w:pPr>
-      <w:r>
-        <w:rPr>
-          <w:i/>
-          <w:iCs/>
-          <w:color w:val="808080"/>
-        </w:rPr>
-        <w:t>{{DATA_ATUALIZACAO_VALORES}}</w:t>
-      </w:r>
-    </w:p>
-    <w:p>
-      <w:pPr>
         <w:pBdr>
           <w:top w:val="single" w:sz="4" w:space="1" w:color="auto"/>
         </w:pBdr>
@@ -277,27 +239,6 @@
       </w:pPr>
       <w:r>
         <w:t>{{MUNICIPAL_TEXTO}}</w:t>
-      </w:r>
-    </w:p>
-    <w:p>
-      <w:pPr>
-        <w:spacing w:afterLines="120" w:after="288" w:line="360" w:lineRule="auto"/>
-        <w:ind w:firstLine="720"/>
-        <w:rPr>
-          <w:i/>
-          <w:iCs/>
-          <w:color w:val="808080"/>
-          <w:sz w:val="24"/>
-          <w:szCs w:val="24"/>
-        </w:rPr>
-      </w:pPr>
-      <w:r>
-        <w:rPr>
-          <w:i/>
-          <w:iCs/>
-          <w:color w:val="808080"/>
-        </w:rPr>
-        <w:t>{{DATA_ATUALIZACAO_VALORES}}</w:t>
       </w:r>
     </w:p>
     <w:p>

</xml_diff>